<commit_message>
Add EUR/RUB price columns and top-5 picks table to DOCX
Co-Authored-By: Claude Opus 4.8 <noreply@anthropic.com>
Claude-Session: https://claude.ai/code/session_019ys2N3WH3aCpLBgavfftgZ
</commit_message>
<xml_diff>
--- a/iPhone17ProMax_chehly_sravnenie.docx
+++ b/iPhone17ProMax_chehly_sravnenie.docx
@@ -25,7 +25,15 @@
         <w:rPr>
           <w:sz w:val="18"/>
         </w:rPr>
-        <w:t>Цены — ориентир в долларах США без скидок; в РФ/ЕС могут отличаться. Названия чехлов кликабельны — ведут на страницы товаров/производителей.</w:t>
+        <w:t>Цены — ориентир без скидок; € и ₽ пересчитаны по курсу ≈ $1 = €0,92 = 95 ₽ и могут отличаться. Названия чехлов кликабельны — ведут на страницы товаров/производителей.</w:t>
+      </w:r>
+    </w:p>
+    <w:p>
+      <w:pPr>
+        <w:pStyle w:val="Heading1"/>
+      </w:pPr>
+      <w:r>
+        <w:t>Лучшие из всех (итог)</w:t>
       </w:r>
     </w:p>
     <w:tbl>
@@ -36,17 +44,31 @@
         <w:tblLook w:firstColumn="1" w:firstRow="1" w:lastColumn="0" w:lastRow="0" w:noHBand="0" w:noVBand="1" w:val="04A0"/>
       </w:tblPr>
       <w:tblGrid>
-        <w:gridCol w:w="2400"/>
-        <w:gridCol w:w="2400"/>
-        <w:gridCol w:w="2400"/>
-        <w:gridCol w:w="2400"/>
-        <w:gridCol w:w="2400"/>
-        <w:gridCol w:w="2400"/>
+        <w:gridCol w:w="4800"/>
+        <w:gridCol w:w="4800"/>
+        <w:gridCol w:w="4800"/>
       </w:tblGrid>
       <w:tr>
         <w:tc>
           <w:tcPr>
-            <w:tcW w:type="dxa" w:w="2880"/>
+            <w:tcW w:type="dxa" w:w="576"/>
+            <w:shd w:val="clear" w:fill="2E5496"/>
+          </w:tcPr>
+          <w:p>
+            <w:r/>
+            <w:r>
+              <w:rPr>
+                <w:b/>
+                <w:color w:val="FFFFFF"/>
+                <w:sz w:val="20"/>
+              </w:rPr>
+              <w:t>#</w:t>
+            </w:r>
+          </w:p>
+        </w:tc>
+        <w:tc>
+          <w:tcPr>
+            <w:tcW w:type="dxa" w:w="3744"/>
             <w:shd w:val="clear" w:fill="2E5496"/>
           </w:tcPr>
           <w:p>
@@ -63,7 +85,336 @@
         </w:tc>
         <w:tc>
           <w:tcPr>
-            <w:tcW w:type="dxa" w:w="2448"/>
+            <w:tcW w:type="dxa" w:w="9360"/>
+            <w:shd w:val="clear" w:fill="2E5496"/>
+          </w:tcPr>
+          <w:p>
+            <w:r/>
+            <w:r>
+              <w:rPr>
+                <w:b/>
+                <w:color w:val="FFFFFF"/>
+                <w:sz w:val="20"/>
+              </w:rPr>
+              <w:t>Почему лучший</w:t>
+            </w:r>
+          </w:p>
+        </w:tc>
+      </w:tr>
+      <w:tr>
+        <w:tc>
+          <w:tcPr>
+            <w:tcW w:type="dxa" w:w="576"/>
+          </w:tcPr>
+          <w:p>
+            <w:pPr>
+              <w:jc w:val="center"/>
+            </w:pPr>
+            <w:r/>
+            <w:r>
+              <w:rPr>
+                <w:b/>
+                <w:sz w:val="22"/>
+              </w:rPr>
+              <w:t>1</w:t>
+            </w:r>
+          </w:p>
+        </w:tc>
+        <w:tc>
+          <w:tcPr>
+            <w:tcW w:type="dxa" w:w="3744"/>
+          </w:tcPr>
+          <w:p>
+            <w:r/>
+            <w:hyperlink r:id="rId9">
+              <w:r>
+                <w:rPr>
+                  <w:color w:val="0563C1"/>
+                  <w:u w:val="single"/>
+                  <w:sz w:val="18"/>
+                </w:rPr>
+                <w:t>Pitaka MagEZ Case 5 (Edge)</w:t>
+              </w:r>
+            </w:hyperlink>
+          </w:p>
+        </w:tc>
+        <w:tc>
+          <w:tcPr>
+            <w:tcW w:type="dxa" w:w="9360"/>
+          </w:tcPr>
+          <w:p>
+            <w:r/>
+            <w:r>
+              <w:rPr>
+                <w:sz w:val="18"/>
+              </w:rPr>
+              <w:t>Лучший в целом: арамид, ультратонкий, не выцветает, идеальный хват и экосистема MagSafe</w:t>
+            </w:r>
+          </w:p>
+        </w:tc>
+      </w:tr>
+      <w:tr>
+        <w:tc>
+          <w:tcPr>
+            <w:tcW w:type="dxa" w:w="576"/>
+            <w:shd w:val="clear" w:fill="EEF3FB"/>
+          </w:tcPr>
+          <w:p>
+            <w:pPr>
+              <w:jc w:val="center"/>
+            </w:pPr>
+            <w:r/>
+            <w:r>
+              <w:rPr>
+                <w:b/>
+                <w:sz w:val="22"/>
+              </w:rPr>
+              <w:t>2</w:t>
+            </w:r>
+          </w:p>
+        </w:tc>
+        <w:tc>
+          <w:tcPr>
+            <w:tcW w:type="dxa" w:w="3744"/>
+            <w:shd w:val="clear" w:fill="EEF3FB"/>
+          </w:tcPr>
+          <w:p>
+            <w:r/>
+            <w:hyperlink r:id="rId10">
+              <w:r>
+                <w:rPr>
+                  <w:color w:val="0563C1"/>
+                  <w:u w:val="single"/>
+                  <w:sz w:val="18"/>
+                </w:rPr>
+                <w:t>Spigen Rugged Armor MagFit</w:t>
+              </w:r>
+            </w:hyperlink>
+          </w:p>
+        </w:tc>
+        <w:tc>
+          <w:tcPr>
+            <w:tcW w:type="dxa" w:w="9360"/>
+            <w:shd w:val="clear" w:fill="EEF3FB"/>
+          </w:tcPr>
+          <w:p>
+            <w:r/>
+            <w:r>
+              <w:rPr>
+                <w:sz w:val="18"/>
+              </w:rPr>
+              <w:t>Лучший универсал по цене / защите на каждый день</w:t>
+            </w:r>
+          </w:p>
+        </w:tc>
+      </w:tr>
+      <w:tr>
+        <w:tc>
+          <w:tcPr>
+            <w:tcW w:type="dxa" w:w="576"/>
+          </w:tcPr>
+          <w:p>
+            <w:pPr>
+              <w:jc w:val="center"/>
+            </w:pPr>
+            <w:r/>
+            <w:r>
+              <w:rPr>
+                <w:b/>
+                <w:sz w:val="22"/>
+              </w:rPr>
+              <w:t>3</w:t>
+            </w:r>
+          </w:p>
+        </w:tc>
+        <w:tc>
+          <w:tcPr>
+            <w:tcW w:type="dxa" w:w="3744"/>
+          </w:tcPr>
+          <w:p>
+            <w:r/>
+            <w:hyperlink r:id="rId11">
+              <w:r>
+                <w:rPr>
+                  <w:color w:val="0563C1"/>
+                  <w:u w:val="single"/>
+                  <w:sz w:val="18"/>
+                </w:rPr>
+                <w:t>Mujjo Full Leather</w:t>
+              </w:r>
+            </w:hyperlink>
+          </w:p>
+        </w:tc>
+        <w:tc>
+          <w:tcPr>
+            <w:tcW w:type="dxa" w:w="9360"/>
+          </w:tcPr>
+          <w:p>
+            <w:r/>
+            <w:r>
+              <w:rPr>
+                <w:sz w:val="18"/>
+              </w:rPr>
+              <w:t>Лучший для статусного образа и тактильности</w:t>
+            </w:r>
+          </w:p>
+        </w:tc>
+      </w:tr>
+      <w:tr>
+        <w:tc>
+          <w:tcPr>
+            <w:tcW w:type="dxa" w:w="576"/>
+            <w:shd w:val="clear" w:fill="EEF3FB"/>
+          </w:tcPr>
+          <w:p>
+            <w:pPr>
+              <w:jc w:val="center"/>
+            </w:pPr>
+            <w:r/>
+            <w:r>
+              <w:rPr>
+                <w:b/>
+                <w:sz w:val="22"/>
+              </w:rPr>
+              <w:t>4</w:t>
+            </w:r>
+          </w:p>
+        </w:tc>
+        <w:tc>
+          <w:tcPr>
+            <w:tcW w:type="dxa" w:w="3744"/>
+            <w:shd w:val="clear" w:fill="EEF3FB"/>
+          </w:tcPr>
+          <w:p>
+            <w:r/>
+            <w:hyperlink r:id="rId12">
+              <w:r>
+                <w:rPr>
+                  <w:color w:val="0563C1"/>
+                  <w:u w:val="single"/>
+                  <w:sz w:val="18"/>
+                </w:rPr>
+                <w:t>Bellroy 3-Card</w:t>
+              </w:r>
+            </w:hyperlink>
+          </w:p>
+        </w:tc>
+        <w:tc>
+          <w:tcPr>
+            <w:tcW w:type="dxa" w:w="9360"/>
+            <w:shd w:val="clear" w:fill="EEF3FB"/>
+          </w:tcPr>
+          <w:p>
+            <w:r/>
+            <w:r>
+              <w:rPr>
+                <w:sz w:val="18"/>
+              </w:rPr>
+              <w:t>Лучший для города без кошелька (телефон + карты)</w:t>
+            </w:r>
+          </w:p>
+        </w:tc>
+      </w:tr>
+      <w:tr>
+        <w:tc>
+          <w:tcPr>
+            <w:tcW w:type="dxa" w:w="576"/>
+          </w:tcPr>
+          <w:p>
+            <w:pPr>
+              <w:jc w:val="center"/>
+            </w:pPr>
+            <w:r/>
+            <w:r>
+              <w:rPr>
+                <w:b/>
+                <w:sz w:val="22"/>
+              </w:rPr>
+              <w:t>5</w:t>
+            </w:r>
+          </w:p>
+        </w:tc>
+        <w:tc>
+          <w:tcPr>
+            <w:tcW w:type="dxa" w:w="3744"/>
+          </w:tcPr>
+          <w:p>
+            <w:r/>
+            <w:hyperlink r:id="rId13">
+              <w:r>
+                <w:rPr>
+                  <w:color w:val="0563C1"/>
+                  <w:u w:val="single"/>
+                  <w:sz w:val="18"/>
+                </w:rPr>
+                <w:t>UNIQ Heldro Air</w:t>
+              </w:r>
+            </w:hyperlink>
+          </w:p>
+        </w:tc>
+        <w:tc>
+          <w:tcPr>
+            <w:tcW w:type="dxa" w:w="9360"/>
+          </w:tcPr>
+          <w:p>
+            <w:r/>
+            <w:r>
+              <w:rPr>
+                <w:sz w:val="18"/>
+              </w:rPr>
+              <w:t>Лучший по соотношению «тонкость + цена»</w:t>
+            </w:r>
+          </w:p>
+        </w:tc>
+      </w:tr>
+    </w:tbl>
+    <w:p/>
+    <w:p>
+      <w:pPr>
+        <w:pStyle w:val="Heading1"/>
+      </w:pPr>
+      <w:r>
+        <w:t>Полная таблица сравнения</w:t>
+      </w:r>
+    </w:p>
+    <w:tbl>
+      <w:tblPr>
+        <w:tblStyle w:val="LightGrid-Accent1"/>
+        <w:tblW w:type="auto" w:w="0"/>
+        <w:jc w:val="center"/>
+        <w:tblLook w:firstColumn="1" w:firstRow="1" w:lastColumn="0" w:lastRow="0" w:noHBand="0" w:noVBand="1" w:val="04A0"/>
+      </w:tblPr>
+      <w:tblGrid>
+        <w:gridCol w:w="1800"/>
+        <w:gridCol w:w="1800"/>
+        <w:gridCol w:w="1800"/>
+        <w:gridCol w:w="1800"/>
+        <w:gridCol w:w="1800"/>
+        <w:gridCol w:w="1800"/>
+        <w:gridCol w:w="1800"/>
+        <w:gridCol w:w="1800"/>
+      </w:tblGrid>
+      <w:tr>
+        <w:tc>
+          <w:tcPr>
+            <w:tcW w:type="dxa" w:w="2736"/>
+            <w:shd w:val="clear" w:fill="2E5496"/>
+          </w:tcPr>
+          <w:p>
+            <w:r/>
+            <w:r>
+              <w:rPr>
+                <w:b/>
+                <w:color w:val="FFFFFF"/>
+                <w:sz w:val="20"/>
+              </w:rPr>
+              <w:t>Чехол</w:t>
+            </w:r>
+          </w:p>
+        </w:tc>
+        <w:tc>
+          <w:tcPr>
+            <w:tcW w:type="dxa" w:w="2160"/>
             <w:shd w:val="clear" w:fill="2E5496"/>
           </w:tcPr>
           <w:p>
@@ -80,7 +431,7 @@
         </w:tc>
         <w:tc>
           <w:tcPr>
-            <w:tcW w:type="dxa" w:w="2160"/>
+            <w:tcW w:type="dxa" w:w="1728"/>
             <w:shd w:val="clear" w:fill="2E5496"/>
           </w:tcPr>
           <w:p>
@@ -97,7 +448,7 @@
         </w:tc>
         <w:tc>
           <w:tcPr>
-            <w:tcW w:type="dxa" w:w="3744"/>
+            <w:tcW w:type="dxa" w:w="3312"/>
             <w:shd w:val="clear" w:fill="2E5496"/>
           </w:tcPr>
           <w:p>
@@ -114,7 +465,7 @@
         </w:tc>
         <w:tc>
           <w:tcPr>
-            <w:tcW w:type="dxa" w:w="2160"/>
+            <w:tcW w:type="dxa" w:w="1872"/>
             <w:shd w:val="clear" w:fill="2E5496"/>
           </w:tcPr>
           <w:p>
@@ -131,7 +482,7 @@
         </w:tc>
         <w:tc>
           <w:tcPr>
-            <w:tcW w:type="dxa" w:w="1440"/>
+            <w:tcW w:type="dxa" w:w="1008"/>
             <w:shd w:val="clear" w:fill="2E5496"/>
           </w:tcPr>
           <w:p>
@@ -142,7 +493,41 @@
                 <w:color w:val="FFFFFF"/>
                 <w:sz w:val="20"/>
               </w:rPr>
-              <w:t>Цена ≈</w:t>
+              <w:t>≈ $</w:t>
+            </w:r>
+          </w:p>
+        </w:tc>
+        <w:tc>
+          <w:tcPr>
+            <w:tcW w:type="dxa" w:w="1008"/>
+            <w:shd w:val="clear" w:fill="2E5496"/>
+          </w:tcPr>
+          <w:p>
+            <w:r/>
+            <w:r>
+              <w:rPr>
+                <w:b/>
+                <w:color w:val="FFFFFF"/>
+                <w:sz w:val="20"/>
+              </w:rPr>
+              <w:t>≈ €</w:t>
+            </w:r>
+          </w:p>
+        </w:tc>
+        <w:tc>
+          <w:tcPr>
+            <w:tcW w:type="dxa" w:w="1296"/>
+            <w:shd w:val="clear" w:fill="2E5496"/>
+          </w:tcPr>
+          <w:p>
+            <w:r/>
+            <w:r>
+              <w:rPr>
+                <w:b/>
+                <w:color w:val="FFFFFF"/>
+                <w:sz w:val="20"/>
+              </w:rPr>
+              <w:t>≈ ₽</w:t>
             </w:r>
           </w:p>
         </w:tc>
@@ -150,7 +535,7 @@
       <w:tr>
         <w:tc>
           <w:tcPr>
-            <w:tcW w:type="dxa" w:w="2880"/>
+            <w:tcW w:type="dxa" w:w="2736"/>
           </w:tcPr>
           <w:p>
             <w:r/>
@@ -168,13 +553,13 @@
         </w:tc>
         <w:tc>
           <w:tcPr>
-            <w:tcW w:type="dxa" w:w="2448"/>
+            <w:tcW w:type="dxa" w:w="2160"/>
           </w:tcPr>
           <w:p>
             <w:r/>
             <w:r>
               <w:rPr>
-                <w:sz w:val="18"/>
+                <w:sz w:val="16"/>
               </w:rPr>
               <w:t>Арамид 600D</w:t>
             </w:r>
@@ -182,13 +567,13 @@
         </w:tc>
         <w:tc>
           <w:tcPr>
-            <w:tcW w:type="dxa" w:w="2160"/>
+            <w:tcW w:type="dxa" w:w="1728"/>
           </w:tcPr>
           <w:p>
             <w:r/>
             <w:r>
               <w:rPr>
-                <w:sz w:val="18"/>
+                <w:sz w:val="16"/>
               </w:rPr>
               <w:t>Ультратонкий</w:t>
             </w:r>
@@ -196,13 +581,13 @@
         </w:tc>
         <w:tc>
           <w:tcPr>
-            <w:tcW w:type="dxa" w:w="3744"/>
+            <w:tcW w:type="dxa" w:w="3312"/>
           </w:tcPr>
           <w:p>
             <w:r/>
             <w:r>
               <w:rPr>
-                <w:sz w:val="18"/>
+                <w:sz w:val="16"/>
               </w:rPr>
               <w:t>Средняя (царапины / лёгкие падения)</w:t>
             </w:r>
@@ -210,13 +595,13 @@
         </w:tc>
         <w:tc>
           <w:tcPr>
-            <w:tcW w:type="dxa" w:w="2160"/>
+            <w:tcW w:type="dxa" w:w="1872"/>
           </w:tcPr>
           <w:p>
             <w:r/>
             <w:r>
               <w:rPr>
-                <w:sz w:val="18"/>
+                <w:sz w:val="16"/>
               </w:rPr>
               <w:t>✓ + экосистема</w:t>
             </w:r>
@@ -224,15 +609,43 @@
         </w:tc>
         <w:tc>
           <w:tcPr>
-            <w:tcW w:type="dxa" w:w="1440"/>
+            <w:tcW w:type="dxa" w:w="1008"/>
           </w:tcPr>
           <w:p>
             <w:r/>
             <w:r>
               <w:rPr>
-                <w:sz w:val="18"/>
+                <w:sz w:val="16"/>
               </w:rPr>
               <w:t>$60–80</w:t>
+            </w:r>
+          </w:p>
+        </w:tc>
+        <w:tc>
+          <w:tcPr>
+            <w:tcW w:type="dxa" w:w="1008"/>
+          </w:tcPr>
+          <w:p>
+            <w:r/>
+            <w:r>
+              <w:rPr>
+                <w:sz w:val="16"/>
+              </w:rPr>
+              <w:t>€55–74</w:t>
+            </w:r>
+          </w:p>
+        </w:tc>
+        <w:tc>
+          <w:tcPr>
+            <w:tcW w:type="dxa" w:w="1296"/>
+          </w:tcPr>
+          <w:p>
+            <w:r/>
+            <w:r>
+              <w:rPr>
+                <w:sz w:val="16"/>
+              </w:rPr>
+              <w:t>5700–7600 ₽</w:t>
             </w:r>
           </w:p>
         </w:tc>
@@ -240,7 +653,7 @@
       <w:tr>
         <w:tc>
           <w:tcPr>
-            <w:tcW w:type="dxa" w:w="2880"/>
+            <w:tcW w:type="dxa" w:w="2736"/>
             <w:shd w:val="clear" w:fill="EEF3FB"/>
           </w:tcPr>
           <w:p>
@@ -259,14 +672,14 @@
         </w:tc>
         <w:tc>
           <w:tcPr>
-            <w:tcW w:type="dxa" w:w="2448"/>
+            <w:tcW w:type="dxa" w:w="2160"/>
             <w:shd w:val="clear" w:fill="EEF3FB"/>
           </w:tcPr>
           <w:p>
             <w:r/>
             <w:r>
               <w:rPr>
-                <w:sz w:val="18"/>
+                <w:sz w:val="16"/>
               </w:rPr>
               <w:t>Арамид + бампер</w:t>
             </w:r>
@@ -274,14 +687,14 @@
         </w:tc>
         <w:tc>
           <w:tcPr>
-            <w:tcW w:type="dxa" w:w="2160"/>
+            <w:tcW w:type="dxa" w:w="1728"/>
             <w:shd w:val="clear" w:fill="EEF3FB"/>
           </w:tcPr>
           <w:p>
             <w:r/>
             <w:r>
               <w:rPr>
-                <w:sz w:val="18"/>
+                <w:sz w:val="16"/>
               </w:rPr>
               <w:t>Тонкий</w:t>
             </w:r>
@@ -289,14 +702,14 @@
         </w:tc>
         <w:tc>
           <w:tcPr>
-            <w:tcW w:type="dxa" w:w="3744"/>
+            <w:tcW w:type="dxa" w:w="3312"/>
             <w:shd w:val="clear" w:fill="EEF3FB"/>
           </w:tcPr>
           <w:p>
             <w:r/>
             <w:r>
               <w:rPr>
-                <w:sz w:val="18"/>
+                <w:sz w:val="16"/>
               </w:rPr>
               <w:t>Средняя–высокая</w:t>
             </w:r>
@@ -304,14 +717,14 @@
         </w:tc>
         <w:tc>
           <w:tcPr>
-            <w:tcW w:type="dxa" w:w="2160"/>
+            <w:tcW w:type="dxa" w:w="1872"/>
             <w:shd w:val="clear" w:fill="EEF3FB"/>
           </w:tcPr>
           <w:p>
             <w:r/>
             <w:r>
               <w:rPr>
-                <w:sz w:val="18"/>
+                <w:sz w:val="16"/>
               </w:rPr>
               <w:t>✓ + экосистема</w:t>
             </w:r>
@@ -319,16 +732,46 @@
         </w:tc>
         <w:tc>
           <w:tcPr>
-            <w:tcW w:type="dxa" w:w="1440"/>
+            <w:tcW w:type="dxa" w:w="1008"/>
             <w:shd w:val="clear" w:fill="EEF3FB"/>
           </w:tcPr>
           <w:p>
             <w:r/>
             <w:r>
               <w:rPr>
-                <w:sz w:val="18"/>
+                <w:sz w:val="16"/>
               </w:rPr>
               <w:t>$70–100</w:t>
+            </w:r>
+          </w:p>
+        </w:tc>
+        <w:tc>
+          <w:tcPr>
+            <w:tcW w:type="dxa" w:w="1008"/>
+            <w:shd w:val="clear" w:fill="EEF3FB"/>
+          </w:tcPr>
+          <w:p>
+            <w:r/>
+            <w:r>
+              <w:rPr>
+                <w:sz w:val="16"/>
+              </w:rPr>
+              <w:t>€64–92</w:t>
+            </w:r>
+          </w:p>
+        </w:tc>
+        <w:tc>
+          <w:tcPr>
+            <w:tcW w:type="dxa" w:w="1296"/>
+            <w:shd w:val="clear" w:fill="EEF3FB"/>
+          </w:tcPr>
+          <w:p>
+            <w:r/>
+            <w:r>
+              <w:rPr>
+                <w:sz w:val="16"/>
+              </w:rPr>
+              <w:t>6700–9500 ₽</w:t>
             </w:r>
           </w:p>
         </w:tc>
@@ -336,11 +779,11 @@
       <w:tr>
         <w:tc>
           <w:tcPr>
-            <w:tcW w:type="dxa" w:w="2880"/>
+            <w:tcW w:type="dxa" w:w="2736"/>
           </w:tcPr>
           <w:p>
             <w:r/>
-            <w:hyperlink r:id="rId10">
+            <w:hyperlink r:id="rId14">
               <w:r>
                 <w:rPr>
                   <w:color w:val="0563C1"/>
@@ -354,13 +797,13 @@
         </w:tc>
         <w:tc>
           <w:tcPr>
-            <w:tcW w:type="dxa" w:w="2448"/>
+            <w:tcW w:type="dxa" w:w="2160"/>
           </w:tcPr>
           <w:p>
             <w:r/>
             <w:r>
               <w:rPr>
-                <w:sz w:val="18"/>
+                <w:sz w:val="16"/>
               </w:rPr>
               <w:t>Арамид / карбон</w:t>
             </w:r>
@@ -368,13 +811,13 @@
         </w:tc>
         <w:tc>
           <w:tcPr>
-            <w:tcW w:type="dxa" w:w="2160"/>
+            <w:tcW w:type="dxa" w:w="1728"/>
           </w:tcPr>
           <w:p>
             <w:r/>
             <w:r>
               <w:rPr>
-                <w:sz w:val="18"/>
+                <w:sz w:val="16"/>
               </w:rPr>
               <w:t>Ультратонкий (~1 мм)</w:t>
             </w:r>
@@ -382,13 +825,13 @@
         </w:tc>
         <w:tc>
           <w:tcPr>
-            <w:tcW w:type="dxa" w:w="3744"/>
+            <w:tcW w:type="dxa" w:w="3312"/>
           </w:tcPr>
           <w:p>
             <w:r/>
             <w:r>
               <w:rPr>
-                <w:sz w:val="18"/>
+                <w:sz w:val="16"/>
               </w:rPr>
               <w:t>Низкая–средняя</w:t>
             </w:r>
@@ -396,13 +839,13 @@
         </w:tc>
         <w:tc>
           <w:tcPr>
-            <w:tcW w:type="dxa" w:w="2160"/>
+            <w:tcW w:type="dxa" w:w="1872"/>
           </w:tcPr>
           <w:p>
             <w:r/>
             <w:r>
               <w:rPr>
-                <w:sz w:val="18"/>
+                <w:sz w:val="16"/>
               </w:rPr>
               <w:t>✓</w:t>
             </w:r>
@@ -410,15 +853,43 @@
         </w:tc>
         <w:tc>
           <w:tcPr>
-            <w:tcW w:type="dxa" w:w="1440"/>
+            <w:tcW w:type="dxa" w:w="1008"/>
           </w:tcPr>
           <w:p>
             <w:r/>
             <w:r>
               <w:rPr>
-                <w:sz w:val="18"/>
+                <w:sz w:val="16"/>
               </w:rPr>
               <w:t>~$70</w:t>
+            </w:r>
+          </w:p>
+        </w:tc>
+        <w:tc>
+          <w:tcPr>
+            <w:tcW w:type="dxa" w:w="1008"/>
+          </w:tcPr>
+          <w:p>
+            <w:r/>
+            <w:r>
+              <w:rPr>
+                <w:sz w:val="16"/>
+              </w:rPr>
+              <w:t>~€64</w:t>
+            </w:r>
+          </w:p>
+        </w:tc>
+        <w:tc>
+          <w:tcPr>
+            <w:tcW w:type="dxa" w:w="1296"/>
+          </w:tcPr>
+          <w:p>
+            <w:r/>
+            <w:r>
+              <w:rPr>
+                <w:sz w:val="16"/>
+              </w:rPr>
+              <w:t>~6700 ₽</w:t>
             </w:r>
           </w:p>
         </w:tc>
@@ -426,12 +897,12 @@
       <w:tr>
         <w:tc>
           <w:tcPr>
-            <w:tcW w:type="dxa" w:w="2880"/>
+            <w:tcW w:type="dxa" w:w="2736"/>
             <w:shd w:val="clear" w:fill="EEF3FB"/>
           </w:tcPr>
           <w:p>
             <w:r/>
-            <w:hyperlink r:id="rId11">
+            <w:hyperlink r:id="rId15">
               <w:r>
                 <w:rPr>
                   <w:color w:val="0563C1"/>
@@ -445,14 +916,14 @@
         </w:tc>
         <w:tc>
           <w:tcPr>
-            <w:tcW w:type="dxa" w:w="2448"/>
+            <w:tcW w:type="dxa" w:w="2160"/>
             <w:shd w:val="clear" w:fill="EEF3FB"/>
           </w:tcPr>
           <w:p>
             <w:r/>
             <w:r>
               <w:rPr>
-                <w:sz w:val="18"/>
+                <w:sz w:val="16"/>
               </w:rPr>
               <w:t>Настоящий 3K карбон</w:t>
             </w:r>
@@ -460,14 +931,14 @@
         </w:tc>
         <w:tc>
           <w:tcPr>
-            <w:tcW w:type="dxa" w:w="2160"/>
+            <w:tcW w:type="dxa" w:w="1728"/>
             <w:shd w:val="clear" w:fill="EEF3FB"/>
           </w:tcPr>
           <w:p>
             <w:r/>
             <w:r>
               <w:rPr>
-                <w:sz w:val="18"/>
+                <w:sz w:val="16"/>
               </w:rPr>
               <w:t>Тонкий</w:t>
             </w:r>
@@ -475,14 +946,14 @@
         </w:tc>
         <w:tc>
           <w:tcPr>
-            <w:tcW w:type="dxa" w:w="3744"/>
+            <w:tcW w:type="dxa" w:w="3312"/>
             <w:shd w:val="clear" w:fill="EEF3FB"/>
           </w:tcPr>
           <w:p>
             <w:r/>
             <w:r>
               <w:rPr>
-                <w:sz w:val="18"/>
+                <w:sz w:val="16"/>
               </w:rPr>
               <w:t>Средняя</w:t>
             </w:r>
@@ -490,14 +961,14 @@
         </w:tc>
         <w:tc>
           <w:tcPr>
-            <w:tcW w:type="dxa" w:w="2160"/>
+            <w:tcW w:type="dxa" w:w="1872"/>
             <w:shd w:val="clear" w:fill="EEF3FB"/>
           </w:tcPr>
           <w:p>
             <w:r/>
             <w:r>
               <w:rPr>
-                <w:sz w:val="18"/>
+                <w:sz w:val="16"/>
               </w:rPr>
               <w:t>✓</w:t>
             </w:r>
@@ -505,16 +976,46 @@
         </w:tc>
         <w:tc>
           <w:tcPr>
-            <w:tcW w:type="dxa" w:w="1440"/>
+            <w:tcW w:type="dxa" w:w="1008"/>
             <w:shd w:val="clear" w:fill="EEF3FB"/>
           </w:tcPr>
           <w:p>
             <w:r/>
             <w:r>
               <w:rPr>
-                <w:sz w:val="18"/>
+                <w:sz w:val="16"/>
               </w:rPr>
               <w:t>$60–80</w:t>
+            </w:r>
+          </w:p>
+        </w:tc>
+        <w:tc>
+          <w:tcPr>
+            <w:tcW w:type="dxa" w:w="1008"/>
+            <w:shd w:val="clear" w:fill="EEF3FB"/>
+          </w:tcPr>
+          <w:p>
+            <w:r/>
+            <w:r>
+              <w:rPr>
+                <w:sz w:val="16"/>
+              </w:rPr>
+              <w:t>€55–74</w:t>
+            </w:r>
+          </w:p>
+        </w:tc>
+        <w:tc>
+          <w:tcPr>
+            <w:tcW w:type="dxa" w:w="1296"/>
+            <w:shd w:val="clear" w:fill="EEF3FB"/>
+          </w:tcPr>
+          <w:p>
+            <w:r/>
+            <w:r>
+              <w:rPr>
+                <w:sz w:val="16"/>
+              </w:rPr>
+              <w:t>5700–7600 ₽</w:t>
             </w:r>
           </w:p>
         </w:tc>
@@ -522,11 +1023,11 @@
       <w:tr>
         <w:tc>
           <w:tcPr>
-            <w:tcW w:type="dxa" w:w="2880"/>
+            <w:tcW w:type="dxa" w:w="2736"/>
           </w:tcPr>
           <w:p>
             <w:r/>
-            <w:hyperlink r:id="rId12">
+            <w:hyperlink r:id="rId16">
               <w:r>
                 <w:rPr>
                   <w:color w:val="0563C1"/>
@@ -540,13 +1041,13 @@
         </w:tc>
         <w:tc>
           <w:tcPr>
-            <w:tcW w:type="dxa" w:w="2448"/>
+            <w:tcW w:type="dxa" w:w="2160"/>
           </w:tcPr>
           <w:p>
             <w:r/>
             <w:r>
               <w:rPr>
-                <w:sz w:val="18"/>
+                <w:sz w:val="16"/>
               </w:rPr>
               <w:t>Настоящий 3K twill</w:t>
             </w:r>
@@ -554,13 +1055,13 @@
         </w:tc>
         <w:tc>
           <w:tcPr>
-            <w:tcW w:type="dxa" w:w="2160"/>
+            <w:tcW w:type="dxa" w:w="1728"/>
           </w:tcPr>
           <w:p>
             <w:r/>
             <w:r>
               <w:rPr>
-                <w:sz w:val="18"/>
+                <w:sz w:val="16"/>
               </w:rPr>
               <w:t>Тонкий</w:t>
             </w:r>
@@ -568,13 +1069,13 @@
         </w:tc>
         <w:tc>
           <w:tcPr>
-            <w:tcW w:type="dxa" w:w="3744"/>
+            <w:tcW w:type="dxa" w:w="3312"/>
           </w:tcPr>
           <w:p>
             <w:r/>
             <w:r>
               <w:rPr>
-                <w:sz w:val="18"/>
+                <w:sz w:val="16"/>
               </w:rPr>
               <w:t>Средняя</w:t>
             </w:r>
@@ -582,13 +1083,13 @@
         </w:tc>
         <w:tc>
           <w:tcPr>
-            <w:tcW w:type="dxa" w:w="2160"/>
+            <w:tcW w:type="dxa" w:w="1872"/>
           </w:tcPr>
           <w:p>
             <w:r/>
             <w:r>
               <w:rPr>
-                <w:sz w:val="18"/>
+                <w:sz w:val="16"/>
               </w:rPr>
               <w:t>✓</w:t>
             </w:r>
@@ -596,15 +1097,43 @@
         </w:tc>
         <w:tc>
           <w:tcPr>
-            <w:tcW w:type="dxa" w:w="1440"/>
+            <w:tcW w:type="dxa" w:w="1008"/>
           </w:tcPr>
           <w:p>
             <w:r/>
             <w:r>
               <w:rPr>
-                <w:sz w:val="18"/>
+                <w:sz w:val="16"/>
               </w:rPr>
               <w:t>$90–100</w:t>
+            </w:r>
+          </w:p>
+        </w:tc>
+        <w:tc>
+          <w:tcPr>
+            <w:tcW w:type="dxa" w:w="1008"/>
+          </w:tcPr>
+          <w:p>
+            <w:r/>
+            <w:r>
+              <w:rPr>
+                <w:sz w:val="16"/>
+              </w:rPr>
+              <w:t>€83–92</w:t>
+            </w:r>
+          </w:p>
+        </w:tc>
+        <w:tc>
+          <w:tcPr>
+            <w:tcW w:type="dxa" w:w="1296"/>
+          </w:tcPr>
+          <w:p>
+            <w:r/>
+            <w:r>
+              <w:rPr>
+                <w:sz w:val="16"/>
+              </w:rPr>
+              <w:t>8600–9500 ₽</w:t>
             </w:r>
           </w:p>
         </w:tc>
@@ -612,12 +1141,12 @@
       <w:tr>
         <w:tc>
           <w:tcPr>
-            <w:tcW w:type="dxa" w:w="2880"/>
+            <w:tcW w:type="dxa" w:w="2736"/>
             <w:shd w:val="clear" w:fill="EEF3FB"/>
           </w:tcPr>
           <w:p>
             <w:r/>
-            <w:hyperlink r:id="rId13">
+            <w:hyperlink r:id="rId17">
               <w:r>
                 <w:rPr>
                   <w:color w:val="0563C1"/>
@@ -631,14 +1160,14 @@
         </w:tc>
         <w:tc>
           <w:tcPr>
-            <w:tcW w:type="dxa" w:w="2448"/>
+            <w:tcW w:type="dxa" w:w="2160"/>
             <w:shd w:val="clear" w:fill="EEF3FB"/>
           </w:tcPr>
           <w:p>
             <w:r/>
             <w:r>
               <w:rPr>
-                <w:sz w:val="18"/>
+                <w:sz w:val="16"/>
               </w:rPr>
               <w:t>Карбон + TPU-бампер</w:t>
             </w:r>
@@ -646,14 +1175,14 @@
         </w:tc>
         <w:tc>
           <w:tcPr>
-            <w:tcW w:type="dxa" w:w="2160"/>
+            <w:tcW w:type="dxa" w:w="1728"/>
             <w:shd w:val="clear" w:fill="EEF3FB"/>
           </w:tcPr>
           <w:p>
             <w:r/>
             <w:r>
               <w:rPr>
-                <w:sz w:val="18"/>
+                <w:sz w:val="16"/>
               </w:rPr>
               <w:t>Тонкий</w:t>
             </w:r>
@@ -661,14 +1190,14 @@
         </w:tc>
         <w:tc>
           <w:tcPr>
-            <w:tcW w:type="dxa" w:w="3744"/>
+            <w:tcW w:type="dxa" w:w="3312"/>
             <w:shd w:val="clear" w:fill="EEF3FB"/>
           </w:tcPr>
           <w:p>
             <w:r/>
             <w:r>
               <w:rPr>
-                <w:sz w:val="18"/>
+                <w:sz w:val="16"/>
               </w:rPr>
               <w:t>Высокая (углы)</w:t>
             </w:r>
@@ -676,14 +1205,14 @@
         </w:tc>
         <w:tc>
           <w:tcPr>
-            <w:tcW w:type="dxa" w:w="2160"/>
+            <w:tcW w:type="dxa" w:w="1872"/>
             <w:shd w:val="clear" w:fill="EEF3FB"/>
           </w:tcPr>
           <w:p>
             <w:r/>
             <w:r>
               <w:rPr>
-                <w:sz w:val="18"/>
+                <w:sz w:val="16"/>
               </w:rPr>
               <w:t>✓</w:t>
             </w:r>
@@ -691,16 +1220,46 @@
         </w:tc>
         <w:tc>
           <w:tcPr>
-            <w:tcW w:type="dxa" w:w="1440"/>
+            <w:tcW w:type="dxa" w:w="1008"/>
             <w:shd w:val="clear" w:fill="EEF3FB"/>
           </w:tcPr>
           <w:p>
             <w:r/>
             <w:r>
               <w:rPr>
-                <w:sz w:val="18"/>
+                <w:sz w:val="16"/>
               </w:rPr>
               <w:t>~$60</w:t>
+            </w:r>
+          </w:p>
+        </w:tc>
+        <w:tc>
+          <w:tcPr>
+            <w:tcW w:type="dxa" w:w="1008"/>
+            <w:shd w:val="clear" w:fill="EEF3FB"/>
+          </w:tcPr>
+          <w:p>
+            <w:r/>
+            <w:r>
+              <w:rPr>
+                <w:sz w:val="16"/>
+              </w:rPr>
+              <w:t>~€55</w:t>
+            </w:r>
+          </w:p>
+        </w:tc>
+        <w:tc>
+          <w:tcPr>
+            <w:tcW w:type="dxa" w:w="1296"/>
+            <w:shd w:val="clear" w:fill="EEF3FB"/>
+          </w:tcPr>
+          <w:p>
+            <w:r/>
+            <w:r>
+              <w:rPr>
+                <w:sz w:val="16"/>
+              </w:rPr>
+              <w:t>~5700 ₽</w:t>
             </w:r>
           </w:p>
         </w:tc>
@@ -708,11 +1267,11 @@
       <w:tr>
         <w:tc>
           <w:tcPr>
-            <w:tcW w:type="dxa" w:w="2880"/>
+            <w:tcW w:type="dxa" w:w="2736"/>
           </w:tcPr>
           <w:p>
             <w:r/>
-            <w:hyperlink r:id="rId14">
+            <w:hyperlink r:id="rId18">
               <w:r>
                 <w:rPr>
                   <w:color w:val="0563C1"/>
@@ -726,13 +1285,13 @@
         </w:tc>
         <w:tc>
           <w:tcPr>
-            <w:tcW w:type="dxa" w:w="2448"/>
+            <w:tcW w:type="dxa" w:w="2160"/>
           </w:tcPr>
           <w:p>
             <w:r/>
             <w:r>
               <w:rPr>
-                <w:sz w:val="18"/>
+                <w:sz w:val="16"/>
               </w:rPr>
               <w:t>Баллистическое волокно</w:t>
             </w:r>
@@ -740,13 +1299,13 @@
         </w:tc>
         <w:tc>
           <w:tcPr>
-            <w:tcW w:type="dxa" w:w="2160"/>
+            <w:tcW w:type="dxa" w:w="1728"/>
           </w:tcPr>
           <w:p>
             <w:r/>
             <w:r>
               <w:rPr>
-                <w:sz w:val="18"/>
+                <w:sz w:val="16"/>
               </w:rPr>
               <w:t>Ультратонкий</w:t>
             </w:r>
@@ -754,13 +1313,13 @@
         </w:tc>
         <w:tc>
           <w:tcPr>
-            <w:tcW w:type="dxa" w:w="3744"/>
+            <w:tcW w:type="dxa" w:w="3312"/>
           </w:tcPr>
           <w:p>
             <w:r/>
             <w:r>
               <w:rPr>
-                <w:sz w:val="18"/>
+                <w:sz w:val="16"/>
               </w:rPr>
               <w:t>Низкая–средняя</w:t>
             </w:r>
@@ -768,13 +1327,13 @@
         </w:tc>
         <w:tc>
           <w:tcPr>
-            <w:tcW w:type="dxa" w:w="2160"/>
+            <w:tcW w:type="dxa" w:w="1872"/>
           </w:tcPr>
           <w:p>
             <w:r/>
             <w:r>
               <w:rPr>
-                <w:sz w:val="18"/>
+                <w:sz w:val="16"/>
               </w:rPr>
               <w:t>✓</w:t>
             </w:r>
@@ -782,15 +1341,43 @@
         </w:tc>
         <w:tc>
           <w:tcPr>
-            <w:tcW w:type="dxa" w:w="1440"/>
+            <w:tcW w:type="dxa" w:w="1008"/>
           </w:tcPr>
           <w:p>
             <w:r/>
             <w:r>
               <w:rPr>
-                <w:sz w:val="18"/>
+                <w:sz w:val="16"/>
               </w:rPr>
               <w:t>$70–90</w:t>
+            </w:r>
+          </w:p>
+        </w:tc>
+        <w:tc>
+          <w:tcPr>
+            <w:tcW w:type="dxa" w:w="1008"/>
+          </w:tcPr>
+          <w:p>
+            <w:r/>
+            <w:r>
+              <w:rPr>
+                <w:sz w:val="16"/>
+              </w:rPr>
+              <w:t>€64–83</w:t>
+            </w:r>
+          </w:p>
+        </w:tc>
+        <w:tc>
+          <w:tcPr>
+            <w:tcW w:type="dxa" w:w="1296"/>
+          </w:tcPr>
+          <w:p>
+            <w:r/>
+            <w:r>
+              <w:rPr>
+                <w:sz w:val="16"/>
+              </w:rPr>
+              <w:t>6700–8600 ₽</w:t>
             </w:r>
           </w:p>
         </w:tc>
@@ -798,12 +1385,12 @@
       <w:tr>
         <w:tc>
           <w:tcPr>
-            <w:tcW w:type="dxa" w:w="2880"/>
+            <w:tcW w:type="dxa" w:w="2736"/>
             <w:shd w:val="clear" w:fill="EEF3FB"/>
           </w:tcPr>
           <w:p>
             <w:r/>
-            <w:hyperlink r:id="rId15">
+            <w:hyperlink r:id="rId10">
               <w:r>
                 <w:rPr>
                   <w:color w:val="0563C1"/>
@@ -817,14 +1404,14 @@
         </w:tc>
         <w:tc>
           <w:tcPr>
-            <w:tcW w:type="dxa" w:w="2448"/>
+            <w:tcW w:type="dxa" w:w="2160"/>
             <w:shd w:val="clear" w:fill="EEF3FB"/>
           </w:tcPr>
           <w:p>
             <w:r/>
             <w:r>
               <w:rPr>
-                <w:sz w:val="18"/>
+                <w:sz w:val="16"/>
               </w:rPr>
               <w:t>TPU</w:t>
             </w:r>
@@ -832,14 +1419,14 @@
         </w:tc>
         <w:tc>
           <w:tcPr>
-            <w:tcW w:type="dxa" w:w="2160"/>
+            <w:tcW w:type="dxa" w:w="1728"/>
             <w:shd w:val="clear" w:fill="EEF3FB"/>
           </w:tcPr>
           <w:p>
             <w:r/>
             <w:r>
               <w:rPr>
-                <w:sz w:val="18"/>
+                <w:sz w:val="16"/>
               </w:rPr>
               <w:t>Средний</w:t>
             </w:r>
@@ -847,14 +1434,14 @@
         </w:tc>
         <w:tc>
           <w:tcPr>
-            <w:tcW w:type="dxa" w:w="3744"/>
+            <w:tcW w:type="dxa" w:w="3312"/>
             <w:shd w:val="clear" w:fill="EEF3FB"/>
           </w:tcPr>
           <w:p>
             <w:r/>
             <w:r>
               <w:rPr>
-                <w:sz w:val="18"/>
+                <w:sz w:val="16"/>
               </w:rPr>
               <w:t>Высокая</w:t>
             </w:r>
@@ -862,14 +1449,14 @@
         </w:tc>
         <w:tc>
           <w:tcPr>
-            <w:tcW w:type="dxa" w:w="2160"/>
+            <w:tcW w:type="dxa" w:w="1872"/>
             <w:shd w:val="clear" w:fill="EEF3FB"/>
           </w:tcPr>
           <w:p>
             <w:r/>
             <w:r>
               <w:rPr>
-                <w:sz w:val="18"/>
+                <w:sz w:val="16"/>
               </w:rPr>
               <w:t>✓</w:t>
             </w:r>
@@ -877,16 +1464,46 @@
         </w:tc>
         <w:tc>
           <w:tcPr>
-            <w:tcW w:type="dxa" w:w="1440"/>
+            <w:tcW w:type="dxa" w:w="1008"/>
             <w:shd w:val="clear" w:fill="EEF3FB"/>
           </w:tcPr>
           <w:p>
             <w:r/>
             <w:r>
               <w:rPr>
-                <w:sz w:val="18"/>
+                <w:sz w:val="16"/>
               </w:rPr>
               <w:t>~$22</w:t>
+            </w:r>
+          </w:p>
+        </w:tc>
+        <w:tc>
+          <w:tcPr>
+            <w:tcW w:type="dxa" w:w="1008"/>
+            <w:shd w:val="clear" w:fill="EEF3FB"/>
+          </w:tcPr>
+          <w:p>
+            <w:r/>
+            <w:r>
+              <w:rPr>
+                <w:sz w:val="16"/>
+              </w:rPr>
+              <w:t>~€20</w:t>
+            </w:r>
+          </w:p>
+        </w:tc>
+        <w:tc>
+          <w:tcPr>
+            <w:tcW w:type="dxa" w:w="1296"/>
+            <w:shd w:val="clear" w:fill="EEF3FB"/>
+          </w:tcPr>
+          <w:p>
+            <w:r/>
+            <w:r>
+              <w:rPr>
+                <w:sz w:val="16"/>
+              </w:rPr>
+              <w:t>~2100 ₽</w:t>
             </w:r>
           </w:p>
         </w:tc>
@@ -894,11 +1511,11 @@
       <w:tr>
         <w:tc>
           <w:tcPr>
-            <w:tcW w:type="dxa" w:w="2880"/>
+            <w:tcW w:type="dxa" w:w="2736"/>
           </w:tcPr>
           <w:p>
             <w:r/>
-            <w:hyperlink r:id="rId16">
+            <w:hyperlink r:id="rId19">
               <w:r>
                 <w:rPr>
                   <w:color w:val="0563C1"/>
@@ -912,13 +1529,13 @@
         </w:tc>
         <w:tc>
           <w:tcPr>
-            <w:tcW w:type="dxa" w:w="2448"/>
+            <w:tcW w:type="dxa" w:w="2160"/>
           </w:tcPr>
           <w:p>
             <w:r/>
             <w:r>
               <w:rPr>
-                <w:sz w:val="18"/>
+                <w:sz w:val="16"/>
               </w:rPr>
               <w:t>Поликарбонат / TPU</w:t>
             </w:r>
@@ -926,13 +1543,13 @@
         </w:tc>
         <w:tc>
           <w:tcPr>
-            <w:tcW w:type="dxa" w:w="2160"/>
+            <w:tcW w:type="dxa" w:w="1728"/>
           </w:tcPr>
           <w:p>
             <w:r/>
             <w:r>
               <w:rPr>
-                <w:sz w:val="18"/>
+                <w:sz w:val="16"/>
               </w:rPr>
               <w:t>Средний</w:t>
             </w:r>
@@ -940,13 +1557,13 @@
         </w:tc>
         <w:tc>
           <w:tcPr>
-            <w:tcW w:type="dxa" w:w="3744"/>
+            <w:tcW w:type="dxa" w:w="3312"/>
           </w:tcPr>
           <w:p>
             <w:r/>
             <w:r>
               <w:rPr>
-                <w:sz w:val="18"/>
+                <w:sz w:val="16"/>
               </w:rPr>
               <w:t>Высокая (3× MIL)</w:t>
             </w:r>
@@ -954,13 +1571,13 @@
         </w:tc>
         <w:tc>
           <w:tcPr>
-            <w:tcW w:type="dxa" w:w="2160"/>
+            <w:tcW w:type="dxa" w:w="1872"/>
           </w:tcPr>
           <w:p>
             <w:r/>
             <w:r>
               <w:rPr>
-                <w:sz w:val="18"/>
+                <w:sz w:val="16"/>
               </w:rPr>
               <w:t>✓</w:t>
             </w:r>
@@ -968,15 +1585,43 @@
         </w:tc>
         <w:tc>
           <w:tcPr>
-            <w:tcW w:type="dxa" w:w="1440"/>
+            <w:tcW w:type="dxa" w:w="1008"/>
           </w:tcPr>
           <w:p>
             <w:r/>
             <w:r>
               <w:rPr>
-                <w:sz w:val="18"/>
+                <w:sz w:val="16"/>
               </w:rPr>
               <w:t>$50–60</w:t>
+            </w:r>
+          </w:p>
+        </w:tc>
+        <w:tc>
+          <w:tcPr>
+            <w:tcW w:type="dxa" w:w="1008"/>
+          </w:tcPr>
+          <w:p>
+            <w:r/>
+            <w:r>
+              <w:rPr>
+                <w:sz w:val="16"/>
+              </w:rPr>
+              <w:t>€46–55</w:t>
+            </w:r>
+          </w:p>
+        </w:tc>
+        <w:tc>
+          <w:tcPr>
+            <w:tcW w:type="dxa" w:w="1296"/>
+          </w:tcPr>
+          <w:p>
+            <w:r/>
+            <w:r>
+              <w:rPr>
+                <w:sz w:val="16"/>
+              </w:rPr>
+              <w:t>4800–5700 ₽</w:t>
             </w:r>
           </w:p>
         </w:tc>
@@ -984,12 +1629,12 @@
       <w:tr>
         <w:tc>
           <w:tcPr>
-            <w:tcW w:type="dxa" w:w="2880"/>
+            <w:tcW w:type="dxa" w:w="2736"/>
             <w:shd w:val="clear" w:fill="EEF3FB"/>
           </w:tcPr>
           <w:p>
             <w:r/>
-            <w:hyperlink r:id="rId17">
+            <w:hyperlink r:id="rId13">
               <w:r>
                 <w:rPr>
                   <w:color w:val="0563C1"/>
@@ -1003,14 +1648,14 @@
         </w:tc>
         <w:tc>
           <w:tcPr>
-            <w:tcW w:type="dxa" w:w="2448"/>
+            <w:tcW w:type="dxa" w:w="2160"/>
             <w:shd w:val="clear" w:fill="EEF3FB"/>
           </w:tcPr>
           <w:p>
             <w:r/>
             <w:r>
               <w:rPr>
-                <w:sz w:val="18"/>
+                <w:sz w:val="16"/>
               </w:rPr>
               <w:t>TPU / поликарбонат</w:t>
             </w:r>
@@ -1018,14 +1663,14 @@
         </w:tc>
         <w:tc>
           <w:tcPr>
-            <w:tcW w:type="dxa" w:w="2160"/>
+            <w:tcW w:type="dxa" w:w="1728"/>
             <w:shd w:val="clear" w:fill="EEF3FB"/>
           </w:tcPr>
           <w:p>
             <w:r/>
             <w:r>
               <w:rPr>
-                <w:sz w:val="18"/>
+                <w:sz w:val="16"/>
               </w:rPr>
               <w:t>Тонкий</w:t>
             </w:r>
@@ -1033,14 +1678,14 @@
         </w:tc>
         <w:tc>
           <w:tcPr>
-            <w:tcW w:type="dxa" w:w="3744"/>
+            <w:tcW w:type="dxa" w:w="3312"/>
             <w:shd w:val="clear" w:fill="EEF3FB"/>
           </w:tcPr>
           <w:p>
             <w:r/>
             <w:r>
               <w:rPr>
-                <w:sz w:val="18"/>
+                <w:sz w:val="16"/>
               </w:rPr>
               <w:t>Средняя–высокая (до 4 м)</w:t>
             </w:r>
@@ -1048,14 +1693,14 @@
         </w:tc>
         <w:tc>
           <w:tcPr>
-            <w:tcW w:type="dxa" w:w="2160"/>
+            <w:tcW w:type="dxa" w:w="1872"/>
             <w:shd w:val="clear" w:fill="EEF3FB"/>
           </w:tcPr>
           <w:p>
             <w:r/>
             <w:r>
               <w:rPr>
-                <w:sz w:val="18"/>
+                <w:sz w:val="16"/>
               </w:rPr>
               <w:t>✓</w:t>
             </w:r>
@@ -1063,16 +1708,46 @@
         </w:tc>
         <w:tc>
           <w:tcPr>
-            <w:tcW w:type="dxa" w:w="1440"/>
+            <w:tcW w:type="dxa" w:w="1008"/>
             <w:shd w:val="clear" w:fill="EEF3FB"/>
           </w:tcPr>
           <w:p>
             <w:r/>
             <w:r>
               <w:rPr>
-                <w:sz w:val="18"/>
+                <w:sz w:val="16"/>
               </w:rPr>
               <w:t>~$24</w:t>
+            </w:r>
+          </w:p>
+        </w:tc>
+        <w:tc>
+          <w:tcPr>
+            <w:tcW w:type="dxa" w:w="1008"/>
+            <w:shd w:val="clear" w:fill="EEF3FB"/>
+          </w:tcPr>
+          <w:p>
+            <w:r/>
+            <w:r>
+              <w:rPr>
+                <w:sz w:val="16"/>
+              </w:rPr>
+              <w:t>~€22</w:t>
+            </w:r>
+          </w:p>
+        </w:tc>
+        <w:tc>
+          <w:tcPr>
+            <w:tcW w:type="dxa" w:w="1296"/>
+            <w:shd w:val="clear" w:fill="EEF3FB"/>
+          </w:tcPr>
+          <w:p>
+            <w:r/>
+            <w:r>
+              <w:rPr>
+                <w:sz w:val="16"/>
+              </w:rPr>
+              <w:t>~2300 ₽</w:t>
             </w:r>
           </w:p>
         </w:tc>
@@ -1080,11 +1755,11 @@
       <w:tr>
         <w:tc>
           <w:tcPr>
-            <w:tcW w:type="dxa" w:w="2880"/>
+            <w:tcW w:type="dxa" w:w="2736"/>
           </w:tcPr>
           <w:p>
             <w:r/>
-            <w:hyperlink r:id="rId18">
+            <w:hyperlink r:id="rId20">
               <w:r>
                 <w:rPr>
                   <w:color w:val="0563C1"/>
@@ -1098,13 +1773,13 @@
         </w:tc>
         <w:tc>
           <w:tcPr>
-            <w:tcW w:type="dxa" w:w="2448"/>
+            <w:tcW w:type="dxa" w:w="2160"/>
           </w:tcPr>
           <w:p>
             <w:r/>
             <w:r>
               <w:rPr>
-                <w:sz w:val="18"/>
+                <w:sz w:val="16"/>
               </w:rPr>
               <w:t>Полупрозрачный PC/TPU</w:t>
             </w:r>
@@ -1112,13 +1787,13 @@
         </w:tc>
         <w:tc>
           <w:tcPr>
-            <w:tcW w:type="dxa" w:w="2160"/>
+            <w:tcW w:type="dxa" w:w="1728"/>
           </w:tcPr>
           <w:p>
             <w:r/>
             <w:r>
               <w:rPr>
-                <w:sz w:val="18"/>
+                <w:sz w:val="16"/>
               </w:rPr>
               <w:t>Тонкий</w:t>
             </w:r>
@@ -1126,13 +1801,13 @@
         </w:tc>
         <w:tc>
           <w:tcPr>
-            <w:tcW w:type="dxa" w:w="3744"/>
+            <w:tcW w:type="dxa" w:w="3312"/>
           </w:tcPr>
           <w:p>
             <w:r/>
             <w:r>
               <w:rPr>
-                <w:sz w:val="18"/>
+                <w:sz w:val="16"/>
               </w:rPr>
               <w:t>Высокая (X-SHOCK)</w:t>
             </w:r>
@@ -1140,13 +1815,13 @@
         </w:tc>
         <w:tc>
           <w:tcPr>
-            <w:tcW w:type="dxa" w:w="2160"/>
+            <w:tcW w:type="dxa" w:w="1872"/>
           </w:tcPr>
           <w:p>
             <w:r/>
             <w:r>
               <w:rPr>
-                <w:sz w:val="18"/>
+                <w:sz w:val="16"/>
               </w:rPr>
               <w:t>✓ (38 магнитов)</w:t>
             </w:r>
@@ -1154,15 +1829,43 @@
         </w:tc>
         <w:tc>
           <w:tcPr>
-            <w:tcW w:type="dxa" w:w="1440"/>
+            <w:tcW w:type="dxa" w:w="1008"/>
           </w:tcPr>
           <w:p>
             <w:r/>
             <w:r>
               <w:rPr>
-                <w:sz w:val="18"/>
+                <w:sz w:val="16"/>
               </w:rPr>
               <w:t>$30–40</w:t>
+            </w:r>
+          </w:p>
+        </w:tc>
+        <w:tc>
+          <w:tcPr>
+            <w:tcW w:type="dxa" w:w="1008"/>
+          </w:tcPr>
+          <w:p>
+            <w:r/>
+            <w:r>
+              <w:rPr>
+                <w:sz w:val="16"/>
+              </w:rPr>
+              <w:t>€28–37</w:t>
+            </w:r>
+          </w:p>
+        </w:tc>
+        <w:tc>
+          <w:tcPr>
+            <w:tcW w:type="dxa" w:w="1296"/>
+          </w:tcPr>
+          <w:p>
+            <w:r/>
+            <w:r>
+              <w:rPr>
+                <w:sz w:val="16"/>
+              </w:rPr>
+              <w:t>2900–3800 ₽</w:t>
             </w:r>
           </w:p>
         </w:tc>
@@ -1170,12 +1873,12 @@
       <w:tr>
         <w:tc>
           <w:tcPr>
-            <w:tcW w:type="dxa" w:w="2880"/>
+            <w:tcW w:type="dxa" w:w="2736"/>
             <w:shd w:val="clear" w:fill="EEF3FB"/>
           </w:tcPr>
           <w:p>
             <w:r/>
-            <w:hyperlink r:id="rId19">
+            <w:hyperlink r:id="rId21">
               <w:r>
                 <w:rPr>
                   <w:color w:val="0563C1"/>
@@ -1189,14 +1892,14 @@
         </w:tc>
         <w:tc>
           <w:tcPr>
-            <w:tcW w:type="dxa" w:w="2448"/>
+            <w:tcW w:type="dxa" w:w="2160"/>
             <w:shd w:val="clear" w:fill="EEF3FB"/>
           </w:tcPr>
           <w:p>
             <w:r/>
             <w:r>
               <w:rPr>
-                <w:sz w:val="18"/>
+                <w:sz w:val="16"/>
               </w:rPr>
               <w:t>Прозрачный TPU</w:t>
             </w:r>
@@ -1204,14 +1907,14 @@
         </w:tc>
         <w:tc>
           <w:tcPr>
-            <w:tcW w:type="dxa" w:w="2160"/>
+            <w:tcW w:type="dxa" w:w="1728"/>
             <w:shd w:val="clear" w:fill="EEF3FB"/>
           </w:tcPr>
           <w:p>
             <w:r/>
             <w:r>
               <w:rPr>
-                <w:sz w:val="18"/>
+                <w:sz w:val="16"/>
               </w:rPr>
               <w:t>Тонкий</w:t>
             </w:r>
@@ -1219,14 +1922,14 @@
         </w:tc>
         <w:tc>
           <w:tcPr>
-            <w:tcW w:type="dxa" w:w="3744"/>
+            <w:tcW w:type="dxa" w:w="3312"/>
             <w:shd w:val="clear" w:fill="EEF3FB"/>
           </w:tcPr>
           <w:p>
             <w:r/>
             <w:r>
               <w:rPr>
-                <w:sz w:val="18"/>
+                <w:sz w:val="16"/>
               </w:rPr>
               <w:t>Средняя–высокая</w:t>
             </w:r>
@@ -1234,14 +1937,14 @@
         </w:tc>
         <w:tc>
           <w:tcPr>
-            <w:tcW w:type="dxa" w:w="2160"/>
+            <w:tcW w:type="dxa" w:w="1872"/>
             <w:shd w:val="clear" w:fill="EEF3FB"/>
           </w:tcPr>
           <w:p>
             <w:r/>
             <w:r>
               <w:rPr>
-                <w:sz w:val="18"/>
+                <w:sz w:val="16"/>
               </w:rPr>
               <w:t>✓</w:t>
             </w:r>
@@ -1249,16 +1952,46 @@
         </w:tc>
         <w:tc>
           <w:tcPr>
-            <w:tcW w:type="dxa" w:w="1440"/>
+            <w:tcW w:type="dxa" w:w="1008"/>
             <w:shd w:val="clear" w:fill="EEF3FB"/>
           </w:tcPr>
           <w:p>
             <w:r/>
             <w:r>
               <w:rPr>
-                <w:sz w:val="18"/>
+                <w:sz w:val="16"/>
               </w:rPr>
               <w:t>$25–35</w:t>
+            </w:r>
+          </w:p>
+        </w:tc>
+        <w:tc>
+          <w:tcPr>
+            <w:tcW w:type="dxa" w:w="1008"/>
+            <w:shd w:val="clear" w:fill="EEF3FB"/>
+          </w:tcPr>
+          <w:p>
+            <w:r/>
+            <w:r>
+              <w:rPr>
+                <w:sz w:val="16"/>
+              </w:rPr>
+              <w:t>€23–32</w:t>
+            </w:r>
+          </w:p>
+        </w:tc>
+        <w:tc>
+          <w:tcPr>
+            <w:tcW w:type="dxa" w:w="1296"/>
+            <w:shd w:val="clear" w:fill="EEF3FB"/>
+          </w:tcPr>
+          <w:p>
+            <w:r/>
+            <w:r>
+              <w:rPr>
+                <w:sz w:val="16"/>
+              </w:rPr>
+              <w:t>2400–3300 ₽</w:t>
             </w:r>
           </w:p>
         </w:tc>
@@ -1266,11 +1999,11 @@
       <w:tr>
         <w:tc>
           <w:tcPr>
-            <w:tcW w:type="dxa" w:w="2880"/>
+            <w:tcW w:type="dxa" w:w="2736"/>
           </w:tcPr>
           <w:p>
             <w:r/>
-            <w:hyperlink r:id="rId20">
+            <w:hyperlink r:id="rId11">
               <w:r>
                 <w:rPr>
                   <w:color w:val="0563C1"/>
@@ -1284,13 +2017,13 @@
         </w:tc>
         <w:tc>
           <w:tcPr>
-            <w:tcW w:type="dxa" w:w="2448"/>
+            <w:tcW w:type="dxa" w:w="2160"/>
           </w:tcPr>
           <w:p>
             <w:r/>
             <w:r>
               <w:rPr>
-                <w:sz w:val="18"/>
+                <w:sz w:val="16"/>
               </w:rPr>
               <w:t>Натуральная кожа</w:t>
             </w:r>
@@ -1298,13 +2031,13 @@
         </w:tc>
         <w:tc>
           <w:tcPr>
-            <w:tcW w:type="dxa" w:w="2160"/>
+            <w:tcW w:type="dxa" w:w="1728"/>
           </w:tcPr>
           <w:p>
             <w:r/>
             <w:r>
               <w:rPr>
-                <w:sz w:val="18"/>
+                <w:sz w:val="16"/>
               </w:rPr>
               <w:t>Тонкий</w:t>
             </w:r>
@@ -1312,13 +2045,13 @@
         </w:tc>
         <w:tc>
           <w:tcPr>
-            <w:tcW w:type="dxa" w:w="3744"/>
+            <w:tcW w:type="dxa" w:w="3312"/>
           </w:tcPr>
           <w:p>
             <w:r/>
             <w:r>
               <w:rPr>
-                <w:sz w:val="18"/>
+                <w:sz w:val="16"/>
               </w:rPr>
               <w:t>Средняя</w:t>
             </w:r>
@@ -1326,13 +2059,13 @@
         </w:tc>
         <w:tc>
           <w:tcPr>
-            <w:tcW w:type="dxa" w:w="2160"/>
+            <w:tcW w:type="dxa" w:w="1872"/>
           </w:tcPr>
           <w:p>
             <w:r/>
             <w:r>
               <w:rPr>
-                <w:sz w:val="18"/>
+                <w:sz w:val="16"/>
               </w:rPr>
               <w:t>✓</w:t>
             </w:r>
@@ -1340,15 +2073,43 @@
         </w:tc>
         <w:tc>
           <w:tcPr>
-            <w:tcW w:type="dxa" w:w="1440"/>
+            <w:tcW w:type="dxa" w:w="1008"/>
           </w:tcPr>
           <w:p>
             <w:r/>
             <w:r>
               <w:rPr>
-                <w:sz w:val="18"/>
+                <w:sz w:val="16"/>
               </w:rPr>
               <w:t>~$65</w:t>
+            </w:r>
+          </w:p>
+        </w:tc>
+        <w:tc>
+          <w:tcPr>
+            <w:tcW w:type="dxa" w:w="1008"/>
+          </w:tcPr>
+          <w:p>
+            <w:r/>
+            <w:r>
+              <w:rPr>
+                <w:sz w:val="16"/>
+              </w:rPr>
+              <w:t>~€60</w:t>
+            </w:r>
+          </w:p>
+        </w:tc>
+        <w:tc>
+          <w:tcPr>
+            <w:tcW w:type="dxa" w:w="1296"/>
+          </w:tcPr>
+          <w:p>
+            <w:r/>
+            <w:r>
+              <w:rPr>
+                <w:sz w:val="16"/>
+              </w:rPr>
+              <w:t>~6200 ₽</w:t>
             </w:r>
           </w:p>
         </w:tc>
@@ -1356,12 +2117,12 @@
       <w:tr>
         <w:tc>
           <w:tcPr>
-            <w:tcW w:type="dxa" w:w="2880"/>
+            <w:tcW w:type="dxa" w:w="2736"/>
             <w:shd w:val="clear" w:fill="EEF3FB"/>
           </w:tcPr>
           <w:p>
             <w:r/>
-            <w:hyperlink r:id="rId21">
+            <w:hyperlink r:id="rId22">
               <w:r>
                 <w:rPr>
                   <w:color w:val="0563C1"/>
@@ -1375,14 +2136,14 @@
         </w:tc>
         <w:tc>
           <w:tcPr>
-            <w:tcW w:type="dxa" w:w="2448"/>
+            <w:tcW w:type="dxa" w:w="2160"/>
             <w:shd w:val="clear" w:fill="EEF3FB"/>
           </w:tcPr>
           <w:p>
             <w:r/>
             <w:r>
               <w:rPr>
-                <w:sz w:val="18"/>
+                <w:sz w:val="16"/>
               </w:rPr>
               <w:t>Кожа Horween</w:t>
             </w:r>
@@ -1390,14 +2151,14 @@
         </w:tc>
         <w:tc>
           <w:tcPr>
-            <w:tcW w:type="dxa" w:w="2160"/>
+            <w:tcW w:type="dxa" w:w="1728"/>
             <w:shd w:val="clear" w:fill="EEF3FB"/>
           </w:tcPr>
           <w:p>
             <w:r/>
             <w:r>
               <w:rPr>
-                <w:sz w:val="18"/>
+                <w:sz w:val="16"/>
               </w:rPr>
               <w:t>Средний</w:t>
             </w:r>
@@ -1405,14 +2166,14 @@
         </w:tc>
         <w:tc>
           <w:tcPr>
-            <w:tcW w:type="dxa" w:w="3744"/>
+            <w:tcW w:type="dxa" w:w="3312"/>
             <w:shd w:val="clear" w:fill="EEF3FB"/>
           </w:tcPr>
           <w:p>
             <w:r/>
             <w:r>
               <w:rPr>
-                <w:sz w:val="18"/>
+                <w:sz w:val="16"/>
               </w:rPr>
               <w:t>Средняя–высокая (бамперы)</w:t>
             </w:r>
@@ -1420,14 +2181,14 @@
         </w:tc>
         <w:tc>
           <w:tcPr>
-            <w:tcW w:type="dxa" w:w="2160"/>
+            <w:tcW w:type="dxa" w:w="1872"/>
             <w:shd w:val="clear" w:fill="EEF3FB"/>
           </w:tcPr>
           <w:p>
             <w:r/>
             <w:r>
               <w:rPr>
-                <w:sz w:val="18"/>
+                <w:sz w:val="16"/>
               </w:rPr>
               <w:t>✓</w:t>
             </w:r>
@@ -1435,16 +2196,46 @@
         </w:tc>
         <w:tc>
           <w:tcPr>
-            <w:tcW w:type="dxa" w:w="1440"/>
+            <w:tcW w:type="dxa" w:w="1008"/>
             <w:shd w:val="clear" w:fill="EEF3FB"/>
           </w:tcPr>
           <w:p>
             <w:r/>
             <w:r>
               <w:rPr>
-                <w:sz w:val="18"/>
+                <w:sz w:val="16"/>
               </w:rPr>
               <w:t>$65–85</w:t>
+            </w:r>
+          </w:p>
+        </w:tc>
+        <w:tc>
+          <w:tcPr>
+            <w:tcW w:type="dxa" w:w="1008"/>
+            <w:shd w:val="clear" w:fill="EEF3FB"/>
+          </w:tcPr>
+          <w:p>
+            <w:r/>
+            <w:r>
+              <w:rPr>
+                <w:sz w:val="16"/>
+              </w:rPr>
+              <w:t>€60–78</w:t>
+            </w:r>
+          </w:p>
+        </w:tc>
+        <w:tc>
+          <w:tcPr>
+            <w:tcW w:type="dxa" w:w="1296"/>
+            <w:shd w:val="clear" w:fill="EEF3FB"/>
+          </w:tcPr>
+          <w:p>
+            <w:r/>
+            <w:r>
+              <w:rPr>
+                <w:sz w:val="16"/>
+              </w:rPr>
+              <w:t>6200–8100 ₽</w:t>
             </w:r>
           </w:p>
         </w:tc>
@@ -1452,11 +2243,11 @@
       <w:tr>
         <w:tc>
           <w:tcPr>
-            <w:tcW w:type="dxa" w:w="2880"/>
+            <w:tcW w:type="dxa" w:w="2736"/>
           </w:tcPr>
           <w:p>
             <w:r/>
-            <w:hyperlink r:id="rId22">
+            <w:hyperlink r:id="rId12">
               <w:r>
                 <w:rPr>
                   <w:color w:val="0563C1"/>
@@ -1470,13 +2261,13 @@
         </w:tc>
         <w:tc>
           <w:tcPr>
-            <w:tcW w:type="dxa" w:w="2448"/>
+            <w:tcW w:type="dxa" w:w="2160"/>
           </w:tcPr>
           <w:p>
             <w:r/>
             <w:r>
               <w:rPr>
-                <w:sz w:val="18"/>
+                <w:sz w:val="16"/>
               </w:rPr>
               <w:t>Кожа + полимер</w:t>
             </w:r>
@@ -1484,13 +2275,13 @@
         </w:tc>
         <w:tc>
           <w:tcPr>
-            <w:tcW w:type="dxa" w:w="2160"/>
+            <w:tcW w:type="dxa" w:w="1728"/>
           </w:tcPr>
           <w:p>
             <w:r/>
             <w:r>
               <w:rPr>
-                <w:sz w:val="18"/>
+                <w:sz w:val="16"/>
               </w:rPr>
               <w:t>Средний</w:t>
             </w:r>
@@ -1498,13 +2289,13 @@
         </w:tc>
         <w:tc>
           <w:tcPr>
-            <w:tcW w:type="dxa" w:w="3744"/>
+            <w:tcW w:type="dxa" w:w="3312"/>
           </w:tcPr>
           <w:p>
             <w:r/>
             <w:r>
               <w:rPr>
-                <w:sz w:val="18"/>
+                <w:sz w:val="16"/>
               </w:rPr>
               <w:t>Средняя</w:t>
             </w:r>
@@ -1512,13 +2303,13 @@
         </w:tc>
         <w:tc>
           <w:tcPr>
-            <w:tcW w:type="dxa" w:w="2160"/>
+            <w:tcW w:type="dxa" w:w="1872"/>
           </w:tcPr>
           <w:p>
             <w:r/>
             <w:r>
               <w:rPr>
-                <w:sz w:val="18"/>
+                <w:sz w:val="16"/>
               </w:rPr>
               <w:t>✓</w:t>
             </w:r>
@@ -1526,15 +2317,43 @@
         </w:tc>
         <w:tc>
           <w:tcPr>
-            <w:tcW w:type="dxa" w:w="1440"/>
+            <w:tcW w:type="dxa" w:w="1008"/>
           </w:tcPr>
           <w:p>
             <w:r/>
             <w:r>
               <w:rPr>
-                <w:sz w:val="18"/>
+                <w:sz w:val="16"/>
               </w:rPr>
               <w:t>~$79</w:t>
+            </w:r>
+          </w:p>
+        </w:tc>
+        <w:tc>
+          <w:tcPr>
+            <w:tcW w:type="dxa" w:w="1008"/>
+          </w:tcPr>
+          <w:p>
+            <w:r/>
+            <w:r>
+              <w:rPr>
+                <w:sz w:val="16"/>
+              </w:rPr>
+              <w:t>~€73</w:t>
+            </w:r>
+          </w:p>
+        </w:tc>
+        <w:tc>
+          <w:tcPr>
+            <w:tcW w:type="dxa" w:w="1296"/>
+          </w:tcPr>
+          <w:p>
+            <w:r/>
+            <w:r>
+              <w:rPr>
+                <w:sz w:val="16"/>
+              </w:rPr>
+              <w:t>~7500 ₽</w:t>
             </w:r>
           </w:p>
         </w:tc>
@@ -1542,7 +2361,7 @@
       <w:tr>
         <w:tc>
           <w:tcPr>
-            <w:tcW w:type="dxa" w:w="2880"/>
+            <w:tcW w:type="dxa" w:w="2736"/>
             <w:shd w:val="clear" w:fill="EEF3FB"/>
           </w:tcPr>
           <w:p>
@@ -1561,14 +2380,14 @@
         </w:tc>
         <w:tc>
           <w:tcPr>
-            <w:tcW w:type="dxa" w:w="2448"/>
+            <w:tcW w:type="dxa" w:w="2160"/>
             <w:shd w:val="clear" w:fill="EEF3FB"/>
           </w:tcPr>
           <w:p>
             <w:r/>
             <w:r>
               <w:rPr>
-                <w:sz w:val="18"/>
+                <w:sz w:val="16"/>
               </w:rPr>
               <w:t>PC / TPU</w:t>
             </w:r>
@@ -1576,14 +2395,14 @@
         </w:tc>
         <w:tc>
           <w:tcPr>
-            <w:tcW w:type="dxa" w:w="2160"/>
+            <w:tcW w:type="dxa" w:w="1728"/>
             <w:shd w:val="clear" w:fill="EEF3FB"/>
           </w:tcPr>
           <w:p>
             <w:r/>
             <w:r>
               <w:rPr>
-                <w:sz w:val="18"/>
+                <w:sz w:val="16"/>
               </w:rPr>
               <w:t>Средний</w:t>
             </w:r>
@@ -1591,14 +2410,14 @@
         </w:tc>
         <w:tc>
           <w:tcPr>
-            <w:tcW w:type="dxa" w:w="3744"/>
+            <w:tcW w:type="dxa" w:w="3312"/>
             <w:shd w:val="clear" w:fill="EEF3FB"/>
           </w:tcPr>
           <w:p>
             <w:r/>
             <w:r>
               <w:rPr>
-                <w:sz w:val="18"/>
+                <w:sz w:val="16"/>
               </w:rPr>
               <w:t>Средняя–высокая</w:t>
             </w:r>
@@ -1606,14 +2425,14 @@
         </w:tc>
         <w:tc>
           <w:tcPr>
-            <w:tcW w:type="dxa" w:w="2160"/>
+            <w:tcW w:type="dxa" w:w="1872"/>
             <w:shd w:val="clear" w:fill="EEF3FB"/>
           </w:tcPr>
           <w:p>
             <w:r/>
             <w:r>
               <w:rPr>
-                <w:sz w:val="18"/>
+                <w:sz w:val="16"/>
               </w:rPr>
               <w:t>✓ + подставка</w:t>
             </w:r>
@@ -1621,16 +2440,46 @@
         </w:tc>
         <w:tc>
           <w:tcPr>
-            <w:tcW w:type="dxa" w:w="1440"/>
+            <w:tcW w:type="dxa" w:w="1008"/>
             <w:shd w:val="clear" w:fill="EEF3FB"/>
           </w:tcPr>
           <w:p>
             <w:r/>
             <w:r>
               <w:rPr>
-                <w:sz w:val="18"/>
+                <w:sz w:val="16"/>
               </w:rPr>
               <w:t>$20–30</w:t>
+            </w:r>
+          </w:p>
+        </w:tc>
+        <w:tc>
+          <w:tcPr>
+            <w:tcW w:type="dxa" w:w="1008"/>
+            <w:shd w:val="clear" w:fill="EEF3FB"/>
+          </w:tcPr>
+          <w:p>
+            <w:r/>
+            <w:r>
+              <w:rPr>
+                <w:sz w:val="16"/>
+              </w:rPr>
+              <w:t>€18–28</w:t>
+            </w:r>
+          </w:p>
+        </w:tc>
+        <w:tc>
+          <w:tcPr>
+            <w:tcW w:type="dxa" w:w="1296"/>
+            <w:shd w:val="clear" w:fill="EEF3FB"/>
+          </w:tcPr>
+          <w:p>
+            <w:r/>
+            <w:r>
+              <w:rPr>
+                <w:sz w:val="16"/>
+              </w:rPr>
+              <w:t>1900–2900 ₽</w:t>
             </w:r>
           </w:p>
         </w:tc>
@@ -1638,7 +2487,7 @@
       <w:tr>
         <w:tc>
           <w:tcPr>
-            <w:tcW w:type="dxa" w:w="2880"/>
+            <w:tcW w:type="dxa" w:w="2736"/>
           </w:tcPr>
           <w:p>
             <w:r/>
@@ -1656,13 +2505,13 @@
         </w:tc>
         <w:tc>
           <w:tcPr>
-            <w:tcW w:type="dxa" w:w="2448"/>
+            <w:tcW w:type="dxa" w:w="2160"/>
           </w:tcPr>
           <w:p>
             <w:r/>
             <w:r>
               <w:rPr>
-                <w:sz w:val="18"/>
+                <w:sz w:val="16"/>
               </w:rPr>
               <w:t>TPU / металл</w:t>
             </w:r>
@@ -1670,13 +2519,13 @@
         </w:tc>
         <w:tc>
           <w:tcPr>
-            <w:tcW w:type="dxa" w:w="2160"/>
+            <w:tcW w:type="dxa" w:w="1728"/>
           </w:tcPr>
           <w:p>
             <w:r/>
             <w:r>
               <w:rPr>
-                <w:sz w:val="18"/>
+                <w:sz w:val="16"/>
               </w:rPr>
               <w:t>Тонкий</w:t>
             </w:r>
@@ -1684,13 +2533,13 @@
         </w:tc>
         <w:tc>
           <w:tcPr>
-            <w:tcW w:type="dxa" w:w="3744"/>
+            <w:tcW w:type="dxa" w:w="3312"/>
           </w:tcPr>
           <w:p>
             <w:r/>
             <w:r>
               <w:rPr>
-                <w:sz w:val="18"/>
+                <w:sz w:val="16"/>
               </w:rPr>
               <w:t>Средняя</w:t>
             </w:r>
@@ -1698,13 +2547,13 @@
         </w:tc>
         <w:tc>
           <w:tcPr>
-            <w:tcW w:type="dxa" w:w="2160"/>
+            <w:tcW w:type="dxa" w:w="1872"/>
           </w:tcPr>
           <w:p>
             <w:r/>
             <w:r>
               <w:rPr>
-                <w:sz w:val="18"/>
+                <w:sz w:val="16"/>
               </w:rPr>
               <w:t>✓</w:t>
             </w:r>
@@ -1712,15 +2561,43 @@
         </w:tc>
         <w:tc>
           <w:tcPr>
-            <w:tcW w:type="dxa" w:w="1440"/>
+            <w:tcW w:type="dxa" w:w="1008"/>
           </w:tcPr>
           <w:p>
             <w:r/>
             <w:r>
               <w:rPr>
-                <w:sz w:val="18"/>
+                <w:sz w:val="16"/>
               </w:rPr>
               <w:t>~$50</w:t>
+            </w:r>
+          </w:p>
+        </w:tc>
+        <w:tc>
+          <w:tcPr>
+            <w:tcW w:type="dxa" w:w="1008"/>
+          </w:tcPr>
+          <w:p>
+            <w:r/>
+            <w:r>
+              <w:rPr>
+                <w:sz w:val="16"/>
+              </w:rPr>
+              <w:t>~€46</w:t>
+            </w:r>
+          </w:p>
+        </w:tc>
+        <w:tc>
+          <w:tcPr>
+            <w:tcW w:type="dxa" w:w="1296"/>
+          </w:tcPr>
+          <w:p>
+            <w:r/>
+            <w:r>
+              <w:rPr>
+                <w:sz w:val="16"/>
+              </w:rPr>
+              <w:t>~4800 ₽</w:t>
             </w:r>
           </w:p>
         </w:tc>

</xml_diff>

<commit_message>
Add bumper and skeleton cases (Arc Pulse, RhinoShield, dbrand Ghost) to tables
Co-Authored-By: Claude Opus 4.8 <noreply@anthropic.com>
Claude-Session: https://claude.ai/code/session_019ys2N3WH3aCpLBgavfftgZ
</commit_message>
<xml_diff>
--- a/iPhone17ProMax_chehly_sravnenie.docx
+++ b/iPhone17ProMax_chehly_sravnenie.docx
@@ -1390,6 +1390,494 @@
           </w:tcPr>
           <w:p>
             <w:r/>
+            <w:hyperlink r:id="rId19">
+              <w:r>
+                <w:rPr>
+                  <w:color w:val="0563C1"/>
+                  <w:u w:val="single"/>
+                  <w:sz w:val="18"/>
+                </w:rPr>
+                <w:t>Arc Pulse (бампер)</w:t>
+              </w:r>
+            </w:hyperlink>
+          </w:p>
+        </w:tc>
+        <w:tc>
+          <w:tcPr>
+            <w:tcW w:type="dxa" w:w="2160"/>
+            <w:shd w:val="clear" w:fill="EEF3FB"/>
+          </w:tcPr>
+          <w:p>
+            <w:r/>
+            <w:r>
+              <w:rPr>
+                <w:sz w:val="16"/>
+              </w:rPr>
+              <w:t>Алюминий 7075</w:t>
+            </w:r>
+          </w:p>
+        </w:tc>
+        <w:tc>
+          <w:tcPr>
+            <w:tcW w:type="dxa" w:w="1728"/>
+            <w:shd w:val="clear" w:fill="EEF3FB"/>
+          </w:tcPr>
+          <w:p>
+            <w:r/>
+            <w:r>
+              <w:rPr>
+                <w:sz w:val="16"/>
+              </w:rPr>
+              <w:t>Бампер (спина открыта)</w:t>
+            </w:r>
+          </w:p>
+        </w:tc>
+        <w:tc>
+          <w:tcPr>
+            <w:tcW w:type="dxa" w:w="3312"/>
+            <w:shd w:val="clear" w:fill="EEF3FB"/>
+          </w:tcPr>
+          <w:p>
+            <w:r/>
+            <w:r>
+              <w:rPr>
+                <w:sz w:val="16"/>
+              </w:rPr>
+              <w:t>Края / углы (до ~3 м)</w:t>
+            </w:r>
+          </w:p>
+        </w:tc>
+        <w:tc>
+          <w:tcPr>
+            <w:tcW w:type="dxa" w:w="1872"/>
+            <w:shd w:val="clear" w:fill="EEF3FB"/>
+          </w:tcPr>
+          <w:p>
+            <w:r/>
+            <w:r>
+              <w:rPr>
+                <w:sz w:val="16"/>
+              </w:rPr>
+              <w:t>✗ (нет)</w:t>
+            </w:r>
+          </w:p>
+        </w:tc>
+        <w:tc>
+          <w:tcPr>
+            <w:tcW w:type="dxa" w:w="1008"/>
+            <w:shd w:val="clear" w:fill="EEF3FB"/>
+          </w:tcPr>
+          <w:p>
+            <w:r/>
+            <w:r>
+              <w:rPr>
+                <w:sz w:val="16"/>
+              </w:rPr>
+              <w:t>$30–40</w:t>
+            </w:r>
+          </w:p>
+        </w:tc>
+        <w:tc>
+          <w:tcPr>
+            <w:tcW w:type="dxa" w:w="1008"/>
+            <w:shd w:val="clear" w:fill="EEF3FB"/>
+          </w:tcPr>
+          <w:p>
+            <w:r/>
+            <w:r>
+              <w:rPr>
+                <w:sz w:val="16"/>
+              </w:rPr>
+              <w:t>€28–37</w:t>
+            </w:r>
+          </w:p>
+        </w:tc>
+        <w:tc>
+          <w:tcPr>
+            <w:tcW w:type="dxa" w:w="1296"/>
+            <w:shd w:val="clear" w:fill="EEF3FB"/>
+          </w:tcPr>
+          <w:p>
+            <w:r/>
+            <w:r>
+              <w:rPr>
+                <w:sz w:val="16"/>
+              </w:rPr>
+              <w:t>2900–3800 ₽</w:t>
+            </w:r>
+          </w:p>
+        </w:tc>
+      </w:tr>
+      <w:tr>
+        <w:tc>
+          <w:tcPr>
+            <w:tcW w:type="dxa" w:w="2736"/>
+          </w:tcPr>
+          <w:p>
+            <w:r/>
+            <w:hyperlink r:id="rId20">
+              <w:r>
+                <w:rPr>
+                  <w:color w:val="0563C1"/>
+                  <w:u w:val="single"/>
+                  <w:sz w:val="18"/>
+                </w:rPr>
+                <w:t>RhinoShield Mod NX (скелетон)</w:t>
+              </w:r>
+            </w:hyperlink>
+          </w:p>
+        </w:tc>
+        <w:tc>
+          <w:tcPr>
+            <w:tcW w:type="dxa" w:w="2160"/>
+          </w:tcPr>
+          <w:p>
+            <w:r/>
+            <w:r>
+              <w:rPr>
+                <w:sz w:val="16"/>
+              </w:rPr>
+              <w:t>TPU + поликарбонат</w:t>
+            </w:r>
+          </w:p>
+        </w:tc>
+        <w:tc>
+          <w:tcPr>
+            <w:tcW w:type="dxa" w:w="1728"/>
+          </w:tcPr>
+          <w:p>
+            <w:r/>
+            <w:r>
+              <w:rPr>
+                <w:sz w:val="16"/>
+              </w:rPr>
+              <w:t>Бампер / скелетон</w:t>
+            </w:r>
+          </w:p>
+        </w:tc>
+        <w:tc>
+          <w:tcPr>
+            <w:tcW w:type="dxa" w:w="3312"/>
+          </w:tcPr>
+          <w:p>
+            <w:r/>
+            <w:r>
+              <w:rPr>
+                <w:sz w:val="16"/>
+              </w:rPr>
+              <w:t>Высокая по краям (~3,3 м)</w:t>
+            </w:r>
+          </w:p>
+        </w:tc>
+        <w:tc>
+          <w:tcPr>
+            <w:tcW w:type="dxa" w:w="1872"/>
+          </w:tcPr>
+          <w:p>
+            <w:r/>
+            <w:r>
+              <w:rPr>
+                <w:sz w:val="16"/>
+              </w:rPr>
+              <w:t>± (модуль)</w:t>
+            </w:r>
+          </w:p>
+        </w:tc>
+        <w:tc>
+          <w:tcPr>
+            <w:tcW w:type="dxa" w:w="1008"/>
+          </w:tcPr>
+          <w:p>
+            <w:r/>
+            <w:r>
+              <w:rPr>
+                <w:sz w:val="16"/>
+              </w:rPr>
+              <w:t>~$32</w:t>
+            </w:r>
+          </w:p>
+        </w:tc>
+        <w:tc>
+          <w:tcPr>
+            <w:tcW w:type="dxa" w:w="1008"/>
+          </w:tcPr>
+          <w:p>
+            <w:r/>
+            <w:r>
+              <w:rPr>
+                <w:sz w:val="16"/>
+              </w:rPr>
+              <w:t>~€29</w:t>
+            </w:r>
+          </w:p>
+        </w:tc>
+        <w:tc>
+          <w:tcPr>
+            <w:tcW w:type="dxa" w:w="1296"/>
+          </w:tcPr>
+          <w:p>
+            <w:r/>
+            <w:r>
+              <w:rPr>
+                <w:sz w:val="16"/>
+              </w:rPr>
+              <w:t>~3000 ₽</w:t>
+            </w:r>
+          </w:p>
+        </w:tc>
+      </w:tr>
+      <w:tr>
+        <w:tc>
+          <w:tcPr>
+            <w:tcW w:type="dxa" w:w="2736"/>
+            <w:shd w:val="clear" w:fill="EEF3FB"/>
+          </w:tcPr>
+          <w:p>
+            <w:r/>
+            <w:hyperlink r:id="rId20">
+              <w:r>
+                <w:rPr>
+                  <w:color w:val="0563C1"/>
+                  <w:u w:val="single"/>
+                  <w:sz w:val="18"/>
+                </w:rPr>
+                <w:t>RhinoShield CrashGuard NX (бампер)</w:t>
+              </w:r>
+            </w:hyperlink>
+          </w:p>
+        </w:tc>
+        <w:tc>
+          <w:tcPr>
+            <w:tcW w:type="dxa" w:w="2160"/>
+            <w:shd w:val="clear" w:fill="EEF3FB"/>
+          </w:tcPr>
+          <w:p>
+            <w:r/>
+            <w:r>
+              <w:rPr>
+                <w:sz w:val="16"/>
+              </w:rPr>
+              <w:t>TPU + поликарбонат</w:t>
+            </w:r>
+          </w:p>
+        </w:tc>
+        <w:tc>
+          <w:tcPr>
+            <w:tcW w:type="dxa" w:w="1728"/>
+            <w:shd w:val="clear" w:fill="EEF3FB"/>
+          </w:tcPr>
+          <w:p>
+            <w:r/>
+            <w:r>
+              <w:rPr>
+                <w:sz w:val="16"/>
+              </w:rPr>
+              <w:t>Тонкий бампер</w:t>
+            </w:r>
+          </w:p>
+        </w:tc>
+        <w:tc>
+          <w:tcPr>
+            <w:tcW w:type="dxa" w:w="3312"/>
+            <w:shd w:val="clear" w:fill="EEF3FB"/>
+          </w:tcPr>
+          <w:p>
+            <w:r/>
+            <w:r>
+              <w:rPr>
+                <w:sz w:val="16"/>
+              </w:rPr>
+              <w:t>Высокая по краям (3,5 м)</w:t>
+            </w:r>
+          </w:p>
+        </w:tc>
+        <w:tc>
+          <w:tcPr>
+            <w:tcW w:type="dxa" w:w="1872"/>
+            <w:shd w:val="clear" w:fill="EEF3FB"/>
+          </w:tcPr>
+          <w:p>
+            <w:r/>
+            <w:r>
+              <w:rPr>
+                <w:sz w:val="16"/>
+              </w:rPr>
+              <w:t>± (модуль)</w:t>
+            </w:r>
+          </w:p>
+        </w:tc>
+        <w:tc>
+          <w:tcPr>
+            <w:tcW w:type="dxa" w:w="1008"/>
+            <w:shd w:val="clear" w:fill="EEF3FB"/>
+          </w:tcPr>
+          <w:p>
+            <w:r/>
+            <w:r>
+              <w:rPr>
+                <w:sz w:val="16"/>
+              </w:rPr>
+              <w:t>~$25</w:t>
+            </w:r>
+          </w:p>
+        </w:tc>
+        <w:tc>
+          <w:tcPr>
+            <w:tcW w:type="dxa" w:w="1008"/>
+            <w:shd w:val="clear" w:fill="EEF3FB"/>
+          </w:tcPr>
+          <w:p>
+            <w:r/>
+            <w:r>
+              <w:rPr>
+                <w:sz w:val="16"/>
+              </w:rPr>
+              <w:t>~€23</w:t>
+            </w:r>
+          </w:p>
+        </w:tc>
+        <w:tc>
+          <w:tcPr>
+            <w:tcW w:type="dxa" w:w="1296"/>
+            <w:shd w:val="clear" w:fill="EEF3FB"/>
+          </w:tcPr>
+          <w:p>
+            <w:r/>
+            <w:r>
+              <w:rPr>
+                <w:sz w:val="16"/>
+              </w:rPr>
+              <w:t>~2400 ₽</w:t>
+            </w:r>
+          </w:p>
+        </w:tc>
+      </w:tr>
+      <w:tr>
+        <w:tc>
+          <w:tcPr>
+            <w:tcW w:type="dxa" w:w="2736"/>
+          </w:tcPr>
+          <w:p>
+            <w:r/>
+            <w:hyperlink r:id="rId21">
+              <w:r>
+                <w:rPr>
+                  <w:color w:val="0563C1"/>
+                  <w:u w:val="single"/>
+                  <w:sz w:val="18"/>
+                </w:rPr>
+                <w:t>dbrand Ghost 2.0 (скелетон)</w:t>
+              </w:r>
+            </w:hyperlink>
+          </w:p>
+        </w:tc>
+        <w:tc>
+          <w:tcPr>
+            <w:tcW w:type="dxa" w:w="2160"/>
+          </w:tcPr>
+          <w:p>
+            <w:r/>
+            <w:r>
+              <w:rPr>
+                <w:sz w:val="16"/>
+              </w:rPr>
+              <w:t>Прозрачный полимер</w:t>
+            </w:r>
+          </w:p>
+        </w:tc>
+        <w:tc>
+          <w:tcPr>
+            <w:tcW w:type="dxa" w:w="1728"/>
+          </w:tcPr>
+          <w:p>
+            <w:r/>
+            <w:r>
+              <w:rPr>
+                <w:sz w:val="16"/>
+              </w:rPr>
+              <w:t>Ультратонкий</w:t>
+            </w:r>
+          </w:p>
+        </w:tc>
+        <w:tc>
+          <w:tcPr>
+            <w:tcW w:type="dxa" w:w="3312"/>
+          </w:tcPr>
+          <w:p>
+            <w:r/>
+            <w:r>
+              <w:rPr>
+                <w:sz w:val="16"/>
+              </w:rPr>
+              <w:t>Низкая–средняя</w:t>
+            </w:r>
+          </w:p>
+        </w:tc>
+        <w:tc>
+          <w:tcPr>
+            <w:tcW w:type="dxa" w:w="1872"/>
+          </w:tcPr>
+          <w:p>
+            <w:r/>
+            <w:r>
+              <w:rPr>
+                <w:sz w:val="16"/>
+              </w:rPr>
+              <w:t>✓ (18 магнитов)</w:t>
+            </w:r>
+          </w:p>
+        </w:tc>
+        <w:tc>
+          <w:tcPr>
+            <w:tcW w:type="dxa" w:w="1008"/>
+          </w:tcPr>
+          <w:p>
+            <w:r/>
+            <w:r>
+              <w:rPr>
+                <w:sz w:val="16"/>
+              </w:rPr>
+              <w:t>~$50</w:t>
+            </w:r>
+          </w:p>
+        </w:tc>
+        <w:tc>
+          <w:tcPr>
+            <w:tcW w:type="dxa" w:w="1008"/>
+          </w:tcPr>
+          <w:p>
+            <w:r/>
+            <w:r>
+              <w:rPr>
+                <w:sz w:val="16"/>
+              </w:rPr>
+              <w:t>~€46</w:t>
+            </w:r>
+          </w:p>
+        </w:tc>
+        <w:tc>
+          <w:tcPr>
+            <w:tcW w:type="dxa" w:w="1296"/>
+          </w:tcPr>
+          <w:p>
+            <w:r/>
+            <w:r>
+              <w:rPr>
+                <w:sz w:val="16"/>
+              </w:rPr>
+              <w:t>~4800 ₽</w:t>
+            </w:r>
+          </w:p>
+        </w:tc>
+      </w:tr>
+      <w:tr>
+        <w:tc>
+          <w:tcPr>
+            <w:tcW w:type="dxa" w:w="2736"/>
+            <w:shd w:val="clear" w:fill="EEF3FB"/>
+          </w:tcPr>
+          <w:p>
+            <w:r/>
             <w:hyperlink r:id="rId10">
               <w:r>
                 <w:rPr>
@@ -1515,7 +2003,7 @@
           </w:tcPr>
           <w:p>
             <w:r/>
-            <w:hyperlink r:id="rId19">
+            <w:hyperlink r:id="rId22">
               <w:r>
                 <w:rPr>
                   <w:color w:val="0563C1"/>
@@ -1759,7 +2247,7 @@
           </w:tcPr>
           <w:p>
             <w:r/>
-            <w:hyperlink r:id="rId20">
+            <w:hyperlink r:id="rId23">
               <w:r>
                 <w:rPr>
                   <w:color w:val="0563C1"/>
@@ -1878,7 +2366,7 @@
           </w:tcPr>
           <w:p>
             <w:r/>
-            <w:hyperlink r:id="rId21">
+            <w:hyperlink r:id="rId24">
               <w:r>
                 <w:rPr>
                   <w:color w:val="0563C1"/>
@@ -2122,7 +2610,7 @@
           </w:tcPr>
           <w:p>
             <w:r/>
-            <w:hyperlink r:id="rId22">
+            <w:hyperlink r:id="rId25">
               <w:r>
                 <w:rPr>
                   <w:color w:val="0563C1"/>
@@ -2366,7 +2854,7 @@
           </w:tcPr>
           <w:p>
             <w:r/>
-            <w:hyperlink r:id="rId23">
+            <w:hyperlink r:id="rId26">
               <w:r>
                 <w:rPr>
                   <w:color w:val="0563C1"/>
@@ -2491,7 +2979,7 @@
           </w:tcPr>
           <w:p>
             <w:r/>
-            <w:hyperlink r:id="rId24">
+            <w:hyperlink r:id="rId27">
               <w:r>
                 <w:rPr>
                   <w:color w:val="0563C1"/>

</xml_diff>